<commit_message>
feat: other mobile pages
</commit_message>
<xml_diff>
--- a/Document/[ĐATN.CT6.BCĐA] CT060443. Đào Văn Tuyển. Xây dựng Ứng dụng tư vấn pháp luật thông minh V3.docx
+++ b/Document/[ĐATN.CT6.BCĐA] CT060443. Đào Văn Tuyển. Xây dựng Ứng dụng tư vấn pháp luật thông minh V3.docx
@@ -30,12 +30,6 @@
               <w:spacing w:before="120"/>
             </w:pPr>
             <w:r>
-              <w:rPr>
-                <w:lang w:val="vi-VN"/>
-              </w:rPr>
-              <w:t xml:space="preserve">  </w:t>
-            </w:r>
-            <w:r>
               <w:t>BAN CƠ YẾU CHÍNH PHỦ</w:t>
             </w:r>
           </w:p>
@@ -74,21 +68,17 @@
             <w:pPr>
               <w:pStyle w:val="TrangBa"/>
             </w:pPr>
-          </w:p>
-          <w:p>
-            <w:pPr>
-              <w:pStyle w:val="TrangBa"/>
-            </w:pPr>
             <w:r>
               <w:rPr>
                 <w:noProof/>
-                <w:lang w:val="en-US" w:eastAsia="en-US" w:bidi="ar-SA"/>
+                <w:kern w:val="2"/>
+                <w14:ligatures w14:val="standardContextual"/>
               </w:rPr>
               <w:drawing>
-                <wp:inline distT="0" distB="0" distL="0" distR="0" wp14:anchorId="7F45BB16" wp14:editId="3127344D">
-                  <wp:extent cx="1422400" cy="1403350"/>
-                  <wp:effectExtent l="0" t="0" r="6350" b="6350"/>
-                  <wp:docPr id="130" name="Picture 130" descr="Logo HvKTMM"/>
+                <wp:inline distT="0" distB="0" distL="0" distR="0" wp14:anchorId="0F397D66" wp14:editId="2B8C63CF">
+                  <wp:extent cx="1800225" cy="1777792"/>
+                  <wp:effectExtent l="0" t="0" r="0" b="0"/>
+                  <wp:docPr id="739886540" name="Picture 2"/>
                   <wp:cNvGraphicFramePr>
                     <a:graphicFrameLocks xmlns:a="http://schemas.openxmlformats.org/drawingml/2006/main" noChangeAspect="1"/>
                   </wp:cNvGraphicFramePr>
@@ -96,7 +86,7 @@
                     <a:graphicData uri="http://schemas.openxmlformats.org/drawingml/2006/picture">
                       <pic:pic xmlns:pic="http://schemas.openxmlformats.org/drawingml/2006/picture">
                         <pic:nvPicPr>
-                          <pic:cNvPr id="0" name="Picture 130" descr="Logo HvKTMM"/>
+                          <pic:cNvPr id="0" name="Picture 6"/>
                           <pic:cNvPicPr>
                             <a:picLocks noChangeAspect="1" noChangeArrowheads="1"/>
                           </pic:cNvPicPr>
@@ -117,7 +107,7 @@
                         <pic:spPr bwMode="auto">
                           <a:xfrm>
                             <a:off x="0" y="0"/>
-                            <a:ext cx="1422400" cy="1403350"/>
+                            <a:ext cx="1803356" cy="1780884"/>
                           </a:xfrm>
                           <a:prstGeom prst="rect">
                             <a:avLst/>
@@ -133,11 +123,6 @@
                 </wp:inline>
               </w:drawing>
             </w:r>
-          </w:p>
-          <w:p>
-            <w:pPr>
-              <w:pStyle w:val="TrangBa"/>
-            </w:pPr>
           </w:p>
         </w:tc>
       </w:tr>
@@ -574,21 +559,17 @@
             <w:pPr>
               <w:pStyle w:val="TrangBa"/>
             </w:pPr>
-          </w:p>
-          <w:p>
-            <w:pPr>
-              <w:pStyle w:val="TrangBa"/>
-            </w:pPr>
             <w:r>
               <w:rPr>
                 <w:noProof/>
-                <w:lang w:val="en-US" w:eastAsia="en-US" w:bidi="ar-SA"/>
+                <w:kern w:val="2"/>
+                <w14:ligatures w14:val="standardContextual"/>
               </w:rPr>
               <w:drawing>
-                <wp:inline distT="0" distB="0" distL="0" distR="0" wp14:anchorId="480E4ACF" wp14:editId="6758C30F">
-                  <wp:extent cx="1422400" cy="1403350"/>
-                  <wp:effectExtent l="0" t="0" r="6350" b="6350"/>
-                  <wp:docPr id="1" name="Picture 1" descr="Logo HvKTMM"/>
+                <wp:inline distT="0" distB="0" distL="0" distR="0" wp14:anchorId="650359DF" wp14:editId="4C9BBC78">
+                  <wp:extent cx="1800225" cy="1777792"/>
+                  <wp:effectExtent l="0" t="0" r="0" b="0"/>
+                  <wp:docPr id="1315952525" name="Picture 2"/>
                   <wp:cNvGraphicFramePr>
                     <a:graphicFrameLocks xmlns:a="http://schemas.openxmlformats.org/drawingml/2006/main" noChangeAspect="1"/>
                   </wp:cNvGraphicFramePr>
@@ -596,7 +577,7 @@
                     <a:graphicData uri="http://schemas.openxmlformats.org/drawingml/2006/picture">
                       <pic:pic xmlns:pic="http://schemas.openxmlformats.org/drawingml/2006/picture">
                         <pic:nvPicPr>
-                          <pic:cNvPr id="0" name="Picture 1" descr="Logo HvKTMM"/>
+                          <pic:cNvPr id="0" name="Picture 6"/>
                           <pic:cNvPicPr>
                             <a:picLocks noChangeAspect="1" noChangeArrowheads="1"/>
                           </pic:cNvPicPr>
@@ -617,7 +598,7 @@
                         <pic:spPr bwMode="auto">
                           <a:xfrm>
                             <a:off x="0" y="0"/>
-                            <a:ext cx="1422400" cy="1403350"/>
+                            <a:ext cx="1803356" cy="1780884"/>
                           </a:xfrm>
                           <a:prstGeom prst="rect">
                             <a:avLst/>
@@ -10259,111 +10240,65 @@
       <w:bookmarkEnd w:id="5"/>
     </w:p>
     <w:p>
-      <w:pPr>
-        <w:rPr>
-          <w:lang w:val="nl-NL"/>
-        </w:rPr>
-      </w:pPr>
-      <w:r>
-        <w:rPr>
-          <w:lang w:val="nl-NL"/>
-        </w:rPr>
-        <w:t xml:space="preserve">Trong suốt quá trình thực hiện đề tài này, em xin gửi lời tri ân sâu sắc đến các thầy cô tại Học viện Kỹ thuật mật mã, đặc biệt là các thầy cô khoa Công nghệ thông tin, những người đã không ngừng hỗ trợ, chia sẻ kiến thức và kinh nghiệm quý báu. Sự chỉ dẫn tận tình của các thầy cô đã giúp </w:t>
-      </w:r>
-      <w:r>
-        <w:rPr>
-          <w:lang w:val="nl-NL"/>
-        </w:rPr>
+      <w:r>
+        <w:t xml:space="preserve">Trong suốt quá trình thực hiện đề tài này, </w:t>
+      </w:r>
+      <w:r>
         <w:t>em</w:t>
       </w:r>
       <w:r>
-        <w:rPr>
-          <w:lang w:val="nl-NL"/>
-        </w:rPr>
+        <w:t xml:space="preserve"> xin gửi lời tri ân sâu sắc đến các thầy cô tại Học viện Kỹ thuật mật mã, đặc biệt là các thầy cô khoa Công nghệ thông tin, những người đã không ngừng hỗ trợ, chia sẻ kiến thức và kinh nghiệm quý báu. Sự chỉ dẫn tận tình của các thầy cô đã giúp </w:t>
+      </w:r>
+      <w:r>
+        <w:t>em</w:t>
+      </w:r>
+      <w:r>
         <w:t xml:space="preserve"> </w:t>
       </w:r>
       <w:r>
-        <w:rPr>
-          <w:lang w:val="nl-NL"/>
-        </w:rPr>
         <w:t xml:space="preserve">hoàn thành tốt nhiệm vụ và nâng cao kiến thức, kỹ năng trong suốt quá trình học tập. </w:t>
       </w:r>
     </w:p>
     <w:p>
-      <w:pPr>
-        <w:rPr>
-          <w:lang w:val="nl-NL"/>
-        </w:rPr>
-      </w:pPr>
-      <w:r>
-        <w:rPr>
-          <w:lang w:val="nl-NL"/>
-        </w:rPr>
-        <w:t xml:space="preserve">Em xin bày tỏ lòng biết ơn sâu sắc tới thầy Nguyễn Văn Phác, người đã luôn tận tâm hướng dẫn và hỗ trợ em trong suốt quá trình thực hiện đề tài. Nhờ sự chỉ bảo nhiệt tình của thầy, em không chỉ nắm vững kiến thức chuyên môn mà còn trau dồi thêm những kỹ năng mềm quý giá, tinh thần trách nhiệm </w:t>
-      </w:r>
-      <w:r>
-        <w:rPr>
-          <w:lang w:val="nl-NL"/>
-        </w:rPr>
+      <w:r>
+        <w:t>Em</w:t>
+      </w:r>
+      <w:r>
+        <w:t xml:space="preserve"> xin bày tỏ lòng biết ơn sâu sắc tới thầy </w:t>
+      </w:r>
+      <w:r>
+        <w:t>Nguyễn Văn Phác</w:t>
+      </w:r>
+      <w:r>
+        <w:t xml:space="preserve">, người đã luôn tận tâm hướng dẫn và hỗ trợ em trong suốt quá trình thực hiện đề tài. Nhờ sự chỉ bảo nhiệt tình của thầy, em không chỉ nắm vững kiến thức chuyên môn mà còn trau dồi thêm những kỹ năng mềm quý giá, tinh thần trách nhiệm </w:t>
+      </w:r>
+      <w:r>
         <w:t>với đề tài</w:t>
       </w:r>
       <w:r>
-        <w:rPr>
-          <w:lang w:val="nl-NL"/>
-        </w:rPr>
         <w:t xml:space="preserve">. Do kiến thức còn nhiều hạn chế nên không thể tránh khỏi những thiếu sót trong quá trình làm đề tài. </w:t>
       </w:r>
       <w:r>
-        <w:rPr>
-          <w:lang w:val="nl-NL"/>
-        </w:rPr>
         <w:t>Em</w:t>
       </w:r>
       <w:r>
-        <w:rPr>
-          <w:lang w:val="nl-NL"/>
-        </w:rPr>
         <w:t xml:space="preserve"> rất mong nhận được sự đóng góp ý kiến của thầy để đề tài của </w:t>
       </w:r>
       <w:r>
-        <w:rPr>
-          <w:lang w:val="nl-NL"/>
-        </w:rPr>
         <w:t xml:space="preserve">em </w:t>
       </w:r>
       <w:r>
-        <w:rPr>
-          <w:lang w:val="nl-NL"/>
-        </w:rPr>
         <w:t xml:space="preserve">đạt được kết quả tốt hơn. </w:t>
       </w:r>
       <w:r>
-        <w:rPr>
-          <w:lang w:val="nl-NL"/>
-        </w:rPr>
         <w:t xml:space="preserve">Em </w:t>
       </w:r>
       <w:r>
-        <w:rPr>
-          <w:lang w:val="nl-NL"/>
-        </w:rPr>
         <w:t>xin chân thành cảm ơn!</w:t>
       </w:r>
     </w:p>
-    <w:p>
-      <w:pPr>
-        <w:rPr>
-          <w:lang w:val="nl-NL"/>
-        </w:rPr>
-      </w:pPr>
-    </w:p>
-    <w:p>
-      <w:pPr>
-        <w:rPr>
-          <w:lang w:val="nl-NL"/>
-        </w:rPr>
-      </w:pPr>
-    </w:p>
+    <w:p/>
+    <w:p/>
     <w:p>
       <w:pPr>
         <w:ind w:left="4963"/>
@@ -10371,14 +10306,14 @@
         <w:rPr>
           <w:b/>
           <w:bCs/>
-          <w:lang w:val="nl-NL" w:eastAsia="en-AU"/>
+          <w:lang w:eastAsia="en-AU"/>
         </w:rPr>
       </w:pPr>
       <w:r>
         <w:rPr>
           <w:b/>
           <w:bCs/>
-          <w:lang w:val="nl-NL" w:eastAsia="en-AU"/>
+          <w:lang w:eastAsia="en-AU"/>
         </w:rPr>
         <w:t>Sinh viên thực hiện</w:t>
       </w:r>
@@ -10387,7 +10322,7 @@
       <w:pPr>
         <w:jc w:val="right"/>
         <w:rPr>
-          <w:lang w:val="nl-NL" w:eastAsia="en-AU"/>
+          <w:lang w:eastAsia="en-AU"/>
         </w:rPr>
       </w:pPr>
     </w:p>
@@ -10395,7 +10330,7 @@
       <w:pPr>
         <w:jc w:val="right"/>
         <w:rPr>
-          <w:lang w:val="nl-NL" w:eastAsia="en-AU"/>
+          <w:lang w:eastAsia="en-AU"/>
         </w:rPr>
       </w:pPr>
     </w:p>
@@ -10404,86 +10339,26 @@
         <w:ind w:left="4963"/>
         <w:jc w:val="center"/>
         <w:rPr>
-          <w:lang w:val="nl-NL" w:eastAsia="en-AU"/>
-        </w:rPr>
-      </w:pPr>
-      <w:r>
-        <w:rPr>
-          <w:lang w:val="nl-NL" w:eastAsia="en-AU"/>
+          <w:lang w:eastAsia="en-AU"/>
+        </w:rPr>
+      </w:pPr>
+      <w:r>
+        <w:rPr>
+          <w:lang w:eastAsia="en-AU"/>
         </w:rPr>
         <w:t>ĐÀO VĂN TUYỂN</w:t>
       </w:r>
     </w:p>
-    <w:p>
-      <w:pPr>
-        <w:rPr>
-          <w:lang w:val="nl-NL"/>
-        </w:rPr>
-      </w:pPr>
-    </w:p>
-    <w:p>
-      <w:pPr>
-        <w:rPr>
-          <w:lang w:val="nl-NL"/>
-        </w:rPr>
-      </w:pPr>
-    </w:p>
-    <w:p>
-      <w:pPr>
-        <w:rPr>
-          <w:lang w:val="nl-NL"/>
-        </w:rPr>
-      </w:pPr>
-    </w:p>
-    <w:p>
-      <w:pPr>
-        <w:rPr>
-          <w:lang w:val="nl-NL"/>
-        </w:rPr>
-      </w:pPr>
-    </w:p>
-    <w:p>
-      <w:pPr>
-        <w:rPr>
-          <w:lang w:val="nl-NL"/>
-        </w:rPr>
-      </w:pPr>
-    </w:p>
-    <w:p>
-      <w:pPr>
-        <w:rPr>
-          <w:lang w:val="nl-NL"/>
-        </w:rPr>
-      </w:pPr>
-    </w:p>
-    <w:p>
-      <w:pPr>
-        <w:rPr>
-          <w:lang w:val="nl-NL"/>
-        </w:rPr>
-      </w:pPr>
-    </w:p>
-    <w:p>
-      <w:pPr>
-        <w:rPr>
-          <w:lang w:val="nl-NL"/>
-        </w:rPr>
-      </w:pPr>
-    </w:p>
-    <w:p>
-      <w:pPr>
-        <w:rPr>
-          <w:lang w:val="nl-NL"/>
-        </w:rPr>
-      </w:pPr>
-    </w:p>
-    <w:p>
-      <w:pPr>
-        <w:rPr>
-          <w:lang w:val="nl-NL"/>
-        </w:rPr>
-      </w:pPr>
-    </w:p>
+    <w:p/>
+    <w:p/>
+    <w:p/>
+    <w:p/>
+    <w:p/>
+    <w:p/>
+    <w:p/>
+    <w:p/>
+    <w:p/>
+    <w:p/>
     <w:p>
       <w:pPr>
         <w:pStyle w:val="UH1"/>
@@ -10505,12 +10380,12 @@
     <w:p>
       <w:pPr>
         <w:rPr>
-          <w:lang w:val="nl-NL"/>
-        </w:rPr>
-      </w:pPr>
-      <w:r>
-        <w:rPr>
-          <w:lang w:val="nl-NL"/>
+          <w:lang w:val="en-GB"/>
+        </w:rPr>
+      </w:pPr>
+      <w:r>
+        <w:rPr>
+          <w:lang w:val="en-GB"/>
         </w:rPr>
         <w:t>Trong bối cảnh chuyển đổi số mạnh mẽ, việc tiếp cận tri thức pháp luật tại Việt Nam vẫn đang gặp nhiều rào cản do hệ thống văn bản quy phạm pháp luật vô cùng đồ sộ và thường xuyên thay đổi. Các phương pháp tra cứu truyền thống hiện nay chủ yếu dựa trên từ khóa, trả về kết quả là các văn bản dài hàng trăm trang khiến người dân gặp khó khăn trong việc chắt lọc thông tin và hiểu đúng quy định để áp dụng vào thực tiễn.</w:t>
       </w:r>
@@ -10518,12 +10393,12 @@
     <w:p>
       <w:pPr>
         <w:rPr>
-          <w:lang w:val="nl-NL"/>
-        </w:rPr>
-      </w:pPr>
-      <w:r>
-        <w:rPr>
-          <w:lang w:val="nl-NL"/>
+          <w:lang w:val="en-GB"/>
+        </w:rPr>
+      </w:pPr>
+      <w:r>
+        <w:rPr>
+          <w:lang w:val="en-GB"/>
         </w:rPr>
         <w:t xml:space="preserve">Nhận thấy tiềm năng của Trí tuệ nhân tạo, đặc biệt là kỹ thuật RAG (Retrieval-Augmented Generation) kết hợp cùng các Mô hình ngôn ngữ lớn (LLM) trong việc đọc hiểu và tư vấn chính xác theo tình huống, em đã quyết định thực hiện đề tài: </w:t>
       </w:r>
@@ -10531,13 +10406,13 @@
         <w:rPr>
           <w:b/>
           <w:bCs/>
-          <w:lang w:val="nl-NL"/>
+          <w:lang w:val="en-GB"/>
         </w:rPr>
         <w:t>“Xây dựng ứng dụng tư vấn pháp luật thông minh”</w:t>
       </w:r>
       <w:r>
         <w:rPr>
-          <w:lang w:val="nl-NL"/>
+          <w:lang w:val="en-GB"/>
         </w:rPr>
         <w:t>. Đây là giải pháp hướng tới việc xóa bỏ khoảng cách giữa người dân và tri thức pháp lý thông qua sự hỗ trợ của các trợ lý ảo thông minh.</w:t>
       </w:r>
@@ -10545,12 +10420,12 @@
     <w:p>
       <w:pPr>
         <w:rPr>
-          <w:lang w:val="nl-NL"/>
-        </w:rPr>
-      </w:pPr>
-      <w:r>
-        <w:rPr>
-          <w:lang w:val="nl-NL"/>
+          <w:lang w:val="en-GB"/>
+        </w:rPr>
+      </w:pPr>
+      <w:r>
+        <w:rPr>
+          <w:lang w:val="en-GB"/>
         </w:rPr>
         <w:t xml:space="preserve">Mục tiêu của đề tài là xây dựng một hệ thống hoàn chỉnh, bao gồm </w:t>
       </w:r>
@@ -10558,13 +10433,13 @@
         <w:rPr>
           <w:b/>
           <w:bCs/>
-          <w:lang w:val="nl-NL"/>
+          <w:lang w:val="en-GB"/>
         </w:rPr>
         <w:t>ứng dụng di động</w:t>
       </w:r>
       <w:r>
         <w:rPr>
-          <w:lang w:val="nl-NL"/>
+          <w:lang w:val="en-GB"/>
         </w:rPr>
         <w:t xml:space="preserve"> cho người dùng và </w:t>
       </w:r>
@@ -10572,27 +10447,39 @@
         <w:rPr>
           <w:b/>
           <w:bCs/>
-          <w:lang w:val="nl-NL"/>
+          <w:lang w:val="en-GB"/>
         </w:rPr>
         <w:t>nền tảng Web quản trị</w:t>
       </w:r>
       <w:r>
         <w:rPr>
-          <w:lang w:val="nl-NL"/>
-        </w:rPr>
-        <w:t xml:space="preserve"> cho quản trị viên. Hệ thống không chỉ cung cấp khả năng giải đáp thắc mắc pháp lý nhanh chóng, chính xác dựa trên nguồn dữ liệu luật thực tế mà còn hỗ trợ quản lý tập trung kho tri thức, góp phần tối ưu hóa quy trình tra cứu và phổ biến thông tin pháp luật cho cộng đồng.</w:t>
-      </w:r>
-    </w:p>
-    <w:p>
-      <w:pPr>
-        <w:rPr>
-          <w:lang w:val="nl-NL"/>
+          <w:lang w:val="en-GB"/>
+        </w:rPr>
+        <w:t xml:space="preserve"> cho </w:t>
+      </w:r>
+      <w:r>
+        <w:rPr>
+          <w:lang w:val="en-GB"/>
+        </w:rPr>
+        <w:t>quản trị viên</w:t>
+      </w:r>
+      <w:r>
+        <w:rPr>
+          <w:lang w:val="en-GB"/>
+        </w:rPr>
+        <w:t>. Hệ thống không chỉ cung cấp khả năng giải đáp thắc mắc pháp lý nhanh chóng, chính xác dựa trên nguồn dữ liệu luật thực tế mà còn hỗ trợ quản lý tập trung kho tri thức, góp phần tối ưu hóa quy trình tra cứu và phổ biến thông tin pháp luật cho cộng đồng.</w:t>
+      </w:r>
+    </w:p>
+    <w:p>
+      <w:pPr>
+        <w:rPr>
+          <w:lang w:val="en-GB"/>
         </w:rPr>
       </w:pPr>
       <w:r>
         <w:rPr>
           <w:bCs/>
-          <w:lang w:val="nl-NL"/>
+          <w:lang w:val="en-GB"/>
         </w:rPr>
         <w:t>Nội dung của Báo cáo đồ án được chia làm 3 chương:</w:t>
       </w:r>
@@ -10605,33 +10492,33 @@
           <w:numId w:val="4"/>
         </w:numPr>
         <w:rPr>
-          <w:lang w:val="nl-NL"/>
+          <w:lang w:val="en-GB"/>
         </w:rPr>
       </w:pPr>
       <w:r>
         <w:rPr>
           <w:b/>
-          <w:lang w:val="nl-NL"/>
+          <w:lang w:val="en-GB"/>
         </w:rPr>
         <w:t>Chương 1. Phân tích yêu cầu hệ thống</w:t>
       </w:r>
       <w:r>
         <w:rPr>
           <w:b/>
-          <w:lang w:val="nl-NL"/>
+          <w:lang w:val="en-GB"/>
         </w:rPr>
         <w:t xml:space="preserve"> tư vấn pháp luật thông minh</w:t>
       </w:r>
       <w:r>
         <w:rPr>
           <w:b/>
-          <w:lang w:val="nl-NL"/>
+          <w:lang w:val="en-GB"/>
         </w:rPr>
         <w:t xml:space="preserve">: </w:t>
       </w:r>
       <w:r>
         <w:rPr>
-          <w:lang w:val="nl-NL"/>
+          <w:lang w:val="en-GB"/>
         </w:rPr>
         <w:t>Trình bày tổng quan về hệ thống, phân tích các yêu cầu chức năng, phi chức năng và giới thiệu các công nghệ được sử dụng để xây dựng ứng dụng.</w:t>
       </w:r>
@@ -10644,33 +10531,33 @@
           <w:numId w:val="4"/>
         </w:numPr>
         <w:rPr>
-          <w:lang w:val="nl-NL"/>
+          <w:lang w:val="en-GB"/>
         </w:rPr>
       </w:pPr>
       <w:r>
         <w:rPr>
           <w:b/>
-          <w:lang w:val="nl-NL"/>
+          <w:lang w:val="en-GB"/>
         </w:rPr>
         <w:t>Chương 2. Phân tích và thiết kế hệ thống</w:t>
       </w:r>
       <w:r>
         <w:rPr>
           <w:b/>
-          <w:lang w:val="nl-NL"/>
+          <w:lang w:val="en-GB"/>
         </w:rPr>
         <w:t xml:space="preserve"> tư vấn pháp luật thông minh</w:t>
       </w:r>
       <w:r>
         <w:rPr>
           <w:b/>
-          <w:lang w:val="nl-NL"/>
+          <w:lang w:val="en-GB"/>
         </w:rPr>
         <w:t>:</w:t>
       </w:r>
       <w:r>
         <w:rPr>
-          <w:lang w:val="nl-NL"/>
+          <w:lang w:val="en-GB"/>
         </w:rPr>
         <w:t xml:space="preserve"> Phân tích chi tiết quy trình hoạt động, thiết kế kiến trúc hệ thống RAG, thiết kế cơ sở dữ liệu và các luồng chức năng của hệ thống.</w:t>
       </w:r>
@@ -10684,53 +10571,50 @@
         </w:numPr>
         <w:ind w:left="1418"/>
         <w:rPr>
-          <w:lang w:val="nl-NL"/>
+          <w:lang w:val="en-US"/>
         </w:rPr>
       </w:pPr>
       <w:r>
         <w:rPr>
           <w:b/>
-          <w:lang w:val="nl-NL"/>
+          <w:lang w:val="en-GB"/>
         </w:rPr>
         <w:t xml:space="preserve">Chương 3. Triển khai </w:t>
       </w:r>
       <w:r>
         <w:rPr>
           <w:b/>
-          <w:lang w:val="nl-NL"/>
+          <w:lang w:val="en-GB"/>
         </w:rPr>
         <w:t>hệ thống tư vấn pháp luật thông minh</w:t>
       </w:r>
       <w:r>
         <w:rPr>
           <w:b/>
-          <w:lang w:val="nl-NL"/>
+          <w:lang w:val="en-GB"/>
         </w:rPr>
         <w:t>:</w:t>
       </w:r>
       <w:r>
         <w:rPr>
-          <w:lang w:val="nl-NL"/>
+          <w:lang w:val="en-GB"/>
         </w:rPr>
         <w:t xml:space="preserve"> </w:t>
       </w:r>
       <w:r>
-        <w:rPr>
-          <w:lang w:val="nl-NL"/>
-        </w:rPr>
-        <w:t>Mô tả chi tiết quá trình thiết lập môi trường vận hành đa nền tảng, xây dựng quy trình số hóa tri thức pháp luật cho mô hình RAG, tích hợp các thành phần hệ thống và giới thiệu các giao diện hệ th</w:t>
-      </w:r>
-      <w:r>
-        <w:rPr>
-          <w:lang w:val="nl-NL"/>
-        </w:rPr>
+        <w:t xml:space="preserve">Mô tả chi tiết quá trình thiết lập môi trường vận hành đa nền tảng, xây dựng quy trình số hóa tri thức pháp luật cho mô hình RAG, tích hợp các thành phần hệ thống và giới thiệu các giao diện </w:t>
+      </w:r>
+      <w:r>
+        <w:t>hệ th</w:t>
+      </w:r>
+      <w:r>
         <w:t>ố</w:t>
       </w:r>
       <w:r>
-        <w:rPr>
-          <w:lang w:val="nl-NL"/>
-        </w:rPr>
-        <w:t>ng đã hoàn thiện.</w:t>
+        <w:t>ng</w:t>
+      </w:r>
+      <w:r>
+        <w:t xml:space="preserve"> đã hoàn thiện.</w:t>
       </w:r>
     </w:p>
     <w:p>
@@ -10738,15 +10622,12 @@
         <w:pStyle w:val="ListParagraph"/>
         <w:ind w:left="1429" w:firstLine="0"/>
         <w:rPr>
-          <w:lang w:val="nl-NL"/>
-        </w:rPr>
-      </w:pPr>
-    </w:p>
-    <w:p>
-      <w:pPr>
-        <w:rPr>
-          <w:lang w:val="nl-NL"/>
-        </w:rPr>
+          <w:lang w:val="en-GB"/>
+        </w:rPr>
+      </w:pPr>
+    </w:p>
+    <w:p>
+      <w:pPr>
         <w:sectPr>
           <w:footerReference w:type="default" r:id="rId9"/>
           <w:type w:val="continuous"/>
@@ -10762,22 +10643,13 @@
     <w:p>
       <w:pPr>
         <w:pStyle w:val="Heading1"/>
-        <w:rPr>
-          <w:lang w:val="nl-NL"/>
-        </w:rPr>
       </w:pPr>
       <w:bookmarkStart w:id="9" w:name="_Toc227496280"/>
       <w:r>
-        <w:rPr>
-          <w:lang w:val="nl-NL"/>
-        </w:rPr>
         <w:lastRenderedPageBreak/>
         <w:t xml:space="preserve">PHÂN TÍCH YÊU CẦU HỆ THỐNG </w:t>
       </w:r>
       <w:r>
-        <w:rPr>
-          <w:lang w:val="nl-NL"/>
-        </w:rPr>
         <w:t>TƯ VẤN PHÁP LUẬT THÔNG MINH</w:t>
       </w:r>
       <w:bookmarkEnd w:id="9"/>
@@ -10785,21 +10657,12 @@
     <w:p>
       <w:pPr>
         <w:pStyle w:val="Heading2"/>
-        <w:rPr>
-          <w:lang w:val="nl-NL"/>
-        </w:rPr>
       </w:pPr>
       <w:bookmarkStart w:id="10" w:name="_Toc227496281"/>
       <w:r>
-        <w:rPr>
-          <w:lang w:val="nl-NL"/>
-        </w:rPr>
         <w:t>Tổng quan hệ thống</w:t>
       </w:r>
       <w:r>
-        <w:rPr>
-          <w:lang w:val="nl-NL"/>
-        </w:rPr>
         <w:t xml:space="preserve"> tư vấn pháp luật thông minh</w:t>
       </w:r>
       <w:bookmarkEnd w:id="10"/>
@@ -10809,51 +10672,32 @@
         <w:rPr>
           <w:sz w:val="24"/>
           <w:szCs w:val="24"/>
-          <w:lang w:val="nl-NL" w:bidi="ar-SA"/>
-        </w:rPr>
-      </w:pPr>
-      <w:r>
-        <w:rPr>
-          <w:lang w:val="nl-NL"/>
-        </w:rPr>
-        <w:t>Hệ thống tư vấn pháp luật thông minh là một nền tảng công nghệ toàn diện, được xây dựng dựa trên sự kết hợp giữa ứng dụng di động dành cho người dùng và giao diện quản trị trên nền tảng Web. Mục tiêu cốt lõi của hệ thống là hiện đại hóa phương thức tiếp cận pháp luật, giúp người dân tra cứu và hiểu rõ các quy định một cách chính xác, nhanh chóng thông qua sức mạnh của trí tuệ nhân tạo.</w:t>
-      </w:r>
-    </w:p>
-    <w:p>
-      <w:pPr>
-        <w:rPr>
-          <w:lang w:val="nl-NL"/>
-        </w:rPr>
-      </w:pPr>
-      <w:r>
-        <w:rPr>
-          <w:lang w:val="nl-NL"/>
-        </w:rPr>
+          <w:lang w:val="en-GB" w:bidi="ar-SA"/>
+        </w:rPr>
+      </w:pPr>
+      <w:r>
+        <w:t xml:space="preserve">Hệ thống tư vấn pháp luật thông minh là một nền tảng công nghệ toàn diện, được xây dựng dựa trên sự kết hợp giữa </w:t>
+      </w:r>
+      <w:r>
+        <w:t>ứng dụng di động dành cho người dùng và giao diện quản trị trên nền tảng Web</w:t>
+      </w:r>
+      <w:r>
+        <w:t>. Mục tiêu cốt lõi của hệ thống là hiện đại hóa phương thức tiếp cận pháp luật, giúp người dân tra cứu và hiểu rõ các quy định một cách chính xác, nhanh chóng thông qua sức mạnh của trí tuệ nhân tạo.</w:t>
+      </w:r>
+    </w:p>
+    <w:p>
+      <w:r>
         <w:t>Về phía người dùng,</w:t>
       </w:r>
       <w:r>
-        <w:rPr>
-          <w:lang w:val="nl-NL"/>
-        </w:rPr>
         <w:t xml:space="preserve"> </w:t>
       </w:r>
       <w:r>
-        <w:rPr>
-          <w:lang w:val="nl-NL"/>
-        </w:rPr>
         <w:t>ngoài việc tra cứu các văn bản quy phạm pháp luật sẵn có, hệ thống cung cấp một trợ lý ảo thông minh có khả năng tiếp nhận và xử lý các câu hỏi dưới dạng ngôn ngữ tự nhiên. Thay vì phải tự đọc các văn bản dài hàng trăm trang, người dùng sẽ nhận được các câu trả lời súc tích, đi kèm căn cứ pháp lý rõ ràng và trích dẫn trực tiếp từ các văn bản chính thống. Song song với đó, nền tảng Web quản trị đóng vai trò là "trung tâm điều hành", cho phép ban quản trị thực hiện kiểm soát người dùng và cập nhật kịp thời các tệp dữ liệu pháp luật mới nhất vào kho tri thức, đảm bảo tính thời sự và độ tin cậy của nội dung tư vấn.</w:t>
       </w:r>
     </w:p>
     <w:p>
-      <w:pPr>
-        <w:rPr>
-          <w:lang w:val="nl-NL"/>
-        </w:rPr>
-      </w:pPr>
-      <w:r>
-        <w:rPr>
-          <w:lang w:val="nl-NL"/>
-        </w:rPr>
+      <w:r>
         <w:t>Không chỉ đơn thuần là công cụ lưu trữ, hệ thống là một quy trình khép kín từ khâu nạp liệu, xử lý tri thức đến khâu giải đáp thực tiễn. Việc đồng bộ hóa dữ liệu giữa các phân hệ quản trị và ứng dụng giúp thiết lập một môi trường tương tác pháp lý minh bạch, an toàn và dễ tiếp cận. Đây là giải pháp công nghệ trọng tâm nhằm nâng cao hiệu quả phổ biến, giáo dục pháp luật và hỗ trợ cộng đồng chủ động nắm bắt các quyền lợi, nghĩa vụ pháp lý trên nền tảng số.</w:t>
       </w:r>
     </w:p>
@@ -24267,7 +24111,7 @@
       <w:pPr>
         <w:ind w:firstLine="0"/>
         <w:rPr>
-          <w:lang w:val="vi-VN"/>
+          <w:lang w:val="en-GB"/>
         </w:rPr>
       </w:pPr>
     </w:p>
@@ -24275,13 +24119,13 @@
       <w:pPr>
         <w:pStyle w:val="Heading3"/>
         <w:rPr>
-          <w:lang w:val="vi-VN"/>
+          <w:lang w:val="en-GB"/>
         </w:rPr>
       </w:pPr>
       <w:bookmarkStart w:id="70" w:name="_Toc227496309"/>
       <w:r>
         <w:rPr>
-          <w:lang w:val="vi-VN"/>
+          <w:lang w:val="en-GB"/>
         </w:rPr>
         <w:lastRenderedPageBreak/>
         <w:t>Phân tích kết quả đạt được</w:t>
@@ -24289,7 +24133,7 @@
       <w:bookmarkEnd w:id="70"/>
       <w:r>
         <w:rPr>
-          <w:lang w:val="vi-VN"/>
+          <w:lang w:val="en-GB"/>
         </w:rPr>
         <w:t xml:space="preserve"> </w:t>
       </w:r>
@@ -24298,12 +24142,12 @@
       <w:pPr>
         <w:pStyle w:val="Heading4"/>
         <w:rPr>
-          <w:lang w:val="vi-VN"/>
-        </w:rPr>
-      </w:pPr>
-      <w:r>
-        <w:rPr>
-          <w:lang w:val="vi-VN"/>
+          <w:lang w:val="en-GB"/>
+        </w:rPr>
+      </w:pPr>
+      <w:r>
+        <w:rPr>
+          <w:lang w:val="en-GB"/>
         </w:rPr>
         <w:t xml:space="preserve">Độ chính xác của việc truy xuất ngữ cảnh (Retrieval) </w:t>
       </w:r>
@@ -24313,13 +24157,10 @@
         <w:rPr>
           <w:sz w:val="24"/>
           <w:szCs w:val="24"/>
-          <w:lang w:val="vi-VN" w:bidi="ar-SA"/>
-        </w:rPr>
-      </w:pPr>
-      <w:r>
-        <w:rPr>
-          <w:lang w:val="vi-VN"/>
-        </w:rPr>
+          <w:lang w:val="en-GB" w:bidi="ar-SA"/>
+        </w:rPr>
+      </w:pPr>
+      <w:r>
         <w:t xml:space="preserve">Trong kiến trúc RAG, chất lượng câu trả lời phụ thuộc hoàn toàn vào độ chính xác của tài liệu được trích xuất từ cơ sở dữ liệu. Qua quá trình thực nghiệm, sự kết hợp giữa thuật toán phân mảnh đệ quy và mô hình nhúng </w:t>
       </w:r>
       <w:r>
@@ -24328,27 +24169,15 @@
           <w:rFonts w:ascii="Consolas" w:eastAsia="Calibri" w:hAnsi="Consolas"/>
           <w:sz w:val="28"/>
           <w:szCs w:val="28"/>
-          <w:lang w:val="vi-VN"/>
         </w:rPr>
         <w:t>paraphrase-multilingual-MiniLM-L12-v2</w:t>
       </w:r>
       <w:r>
-        <w:rPr>
-          <w:lang w:val="vi-VN"/>
-        </w:rPr>
         <w:t xml:space="preserve"> đã cho thấy hiệu quả vượt trội trong việc xử lý ngôn ngữ pháp lý tiếng Việt.</w:t>
       </w:r>
     </w:p>
     <w:p>
-      <w:pPr>
-        <w:rPr>
-          <w:lang w:val="vi-VN"/>
-        </w:rPr>
-      </w:pPr>
-      <w:r>
-        <w:rPr>
-          <w:lang w:val="vi-VN"/>
-        </w:rPr>
+      <w:r>
         <w:t>Việc thiết lập kích thước phân mảnh (chunk size) ở mức 1200 ký tự cùng độ gối đầu (overlap) 300 ký tự đã giúp bảo toàn trọn vẹn mạch logic của các điều luật. Khi nhận được truy vấn, hệ thống thực hiện tìm kiếm dựa trên độ tương đồng Cosine và giới hạn trả về 5 đoạn văn bản liên quan nhất (Top-K = 5). Số lượng này được đánh giá là điểm cân bằng lý tưởng: cung cấp một lượng ngữ cảnh vừa đủ bao quát vấn đề để mô hình ngôn ngữ phân tích, đồng thời không làm vượt quá giới hạn cửa sổ ngữ cảnh (context window) gây nhiễu thông tin.</w:t>
       </w:r>
     </w:p>
@@ -28664,6 +28493,7 @@
                 <w:rFonts w:ascii="Consolas" w:hAnsi="Consolas"/>
                 <w:lang w:val="en-GB"/>
               </w:rPr>
+              <w:lastRenderedPageBreak/>
               <w:t xml:space="preserve">                if (response.isSuccessful) {</w:t>
             </w:r>
           </w:p>
@@ -29009,6 +28839,7 @@
                 <w:rFonts w:ascii="Consolas" w:hAnsi="Consolas"/>
                 <w:lang w:val="en-GB"/>
               </w:rPr>
+              <w:lastRenderedPageBreak/>
               <w:t xml:space="preserve">        }</w:t>
             </w:r>
           </w:p>
@@ -29303,6 +29134,7 @@
               <w:rPr>
                 <w:rFonts w:ascii="Consolas" w:hAnsi="Consolas"/>
               </w:rPr>
+              <w:lastRenderedPageBreak/>
               <w:t>import axios from 'axios';</w:t>
             </w:r>
           </w:p>
@@ -29639,6 +29471,7 @@
               <w:rPr>
                 <w:rFonts w:ascii="Consolas" w:hAnsi="Consolas"/>
               </w:rPr>
+              <w:lastRenderedPageBreak/>
               <w:t xml:space="preserve">        console.error("Lỗi trong quá trình nạp luật:", error);</w:t>
             </w:r>
           </w:p>
@@ -29686,13 +29519,13 @@
     <w:p>
       <w:pPr>
         <w:rPr>
-          <w:lang w:val="vi-VN"/>
-        </w:rPr>
-      </w:pPr>
-      <w:r>
-        <w:rPr>
           <w:lang w:val="en-GB"/>
         </w:rPr>
+      </w:pPr>
+      <w:r>
+        <w:rPr>
+          <w:lang w:val="en-GB"/>
+        </w:rPr>
         <w:t>Hệ thống Web Quản trị còn tích hợp cơ chế bảo mật nghiêm ngặt thông qua Firebase Authentication. Chỉ những tài khoản được gán vai trò quản trị viên trong hệ thống mới có quyền truy cập vào các chức năng nạp liệu và can thiệp vào bộ nhớ AI. Toàn bộ mã nguồn ReactJS được tối ưu hóa bằng cách phân tách thành các Component độc lập, giúp việc bảo trì và nâng cấp các tính năng quản lý chuyên sâu trong tương lai trở nên dễ dàng và hệ thống hơn.</w:t>
       </w:r>
     </w:p>
@@ -29772,6 +29605,7 @@
       </w:pPr>
       <w:bookmarkStart w:id="85" w:name="_Toc227496319"/>
       <w:r>
+        <w:lastRenderedPageBreak/>
         <w:t>Giới thiệu một số giao diện của hệ thống</w:t>
       </w:r>
       <w:bookmarkEnd w:id="85"/>
@@ -30111,6 +29945,7 @@
         <w:rPr>
           <w:lang w:val="en-GB"/>
         </w:rPr>
+        <w:lastRenderedPageBreak/>
         <w:t>Giao diện Thêm mới văn bản pháp luật</w:t>
       </w:r>
     </w:p>
@@ -30383,6 +30218,7 @@
         <w:rPr>
           <w:lang w:val="en-GB"/>
         </w:rPr>
+        <w:lastRenderedPageBreak/>
         <w:t>Giao diện Quản lý người dùng</w:t>
       </w:r>
     </w:p>
@@ -30681,6 +30517,7 @@
         <w:rPr>
           <w:lang w:val="en-GB"/>
         </w:rPr>
+        <w:lastRenderedPageBreak/>
         <w:t>Giao diện Ứng dụng người dùng</w:t>
       </w:r>
       <w:bookmarkEnd w:id="90"/>
@@ -30739,7 +30576,7 @@
           <w:noProof/>
         </w:rPr>
         <w:drawing>
-          <wp:inline distT="0" distB="0" distL="0" distR="0" wp14:anchorId="35BECAA7" wp14:editId="188676FF">
+          <wp:inline distT="0" distB="0" distL="0" distR="0" wp14:anchorId="35BECAA7" wp14:editId="0E362190">
             <wp:extent cx="2311200" cy="4795200"/>
             <wp:effectExtent l="0" t="0" r="0" b="5715"/>
             <wp:docPr id="1659028545" name="Picture 2"/>
@@ -30977,6 +30814,7 @@
         </w:rPr>
       </w:pPr>
       <w:r>
+        <w:lastRenderedPageBreak/>
         <w:t xml:space="preserve">Giao diện </w:t>
       </w:r>
       <w:r>
@@ -31000,7 +30838,7 @@
           <w:noProof/>
         </w:rPr>
         <w:drawing>
-          <wp:inline distT="0" distB="0" distL="0" distR="0" wp14:anchorId="04136169" wp14:editId="6E1AE314">
+          <wp:inline distT="0" distB="0" distL="0" distR="0" wp14:anchorId="04136169" wp14:editId="3F49D326">
             <wp:extent cx="2311200" cy="4795200"/>
             <wp:effectExtent l="0" t="0" r="0" b="5715"/>
             <wp:docPr id="380379881" name="Picture 3"/>
@@ -31256,6 +31094,7 @@
         <w:rPr>
           <w:lang w:val="en-GB"/>
         </w:rPr>
+        <w:lastRenderedPageBreak/>
         <w:t>Giao diện Tra cứu văn bản</w:t>
       </w:r>
     </w:p>
@@ -31298,9 +31137,8 @@
         <w:rPr>
           <w:noProof/>
         </w:rPr>
-        <w:lastRenderedPageBreak/>
         <w:drawing>
-          <wp:inline distT="0" distB="0" distL="0" distR="0" wp14:anchorId="1984A023" wp14:editId="42E88AA0">
+          <wp:inline distT="0" distB="0" distL="0" distR="0" wp14:anchorId="1984A023" wp14:editId="6E2FEAA6">
             <wp:extent cx="2311200" cy="4795200"/>
             <wp:effectExtent l="0" t="0" r="0" b="5715"/>
             <wp:docPr id="1363190652" name="Picture 4"/>
@@ -31556,6 +31394,7 @@
         <w:rPr>
           <w:lang w:val="en-GB"/>
         </w:rPr>
+        <w:lastRenderedPageBreak/>
         <w:t>Giao diện Xem chi tiết văn bản</w:t>
       </w:r>
     </w:p>
@@ -31849,6 +31688,7 @@
         <w:rPr>
           <w:lang w:val="en-GB"/>
         </w:rPr>
+        <w:lastRenderedPageBreak/>
         <w:t>Giao diện Tư vấn pháp luật</w:t>
       </w:r>
     </w:p>
@@ -31915,7 +31755,7 @@
                 <w:noProof/>
               </w:rPr>
               <w:drawing>
-                <wp:inline distT="0" distB="0" distL="0" distR="0" wp14:anchorId="5DA26CAB" wp14:editId="34191FDF">
+                <wp:inline distT="0" distB="0" distL="0" distR="0" wp14:anchorId="5DA26CAB" wp14:editId="5D284D72">
                   <wp:extent cx="2311200" cy="4795200"/>
                   <wp:effectExtent l="0" t="0" r="0" b="5715"/>
                   <wp:docPr id="1158577167" name="Picture 6"/>
@@ -32153,7 +31993,7 @@
                 <w:noProof/>
               </w:rPr>
               <w:drawing>
-                <wp:inline distT="0" distB="0" distL="0" distR="0" wp14:anchorId="08DF4DCC" wp14:editId="442755F3">
+                <wp:inline distT="0" distB="0" distL="0" distR="0" wp14:anchorId="08DF4DCC" wp14:editId="6B134418">
                   <wp:extent cx="2311200" cy="4795200"/>
                   <wp:effectExtent l="0" t="0" r="0" b="5715"/>
                   <wp:docPr id="585464054" name="Picture 7"/>
@@ -32395,6 +32235,7 @@
         <w:rPr>
           <w:lang w:val="en-GB"/>
         </w:rPr>
+        <w:lastRenderedPageBreak/>
         <w:t>Giao diện</w:t>
       </w:r>
       <w:r>
@@ -32460,9 +32301,8 @@
         <w:rPr>
           <w:noProof/>
         </w:rPr>
-        <w:lastRenderedPageBreak/>
         <w:drawing>
-          <wp:inline distT="0" distB="0" distL="0" distR="0" wp14:anchorId="58DB5AE5" wp14:editId="377CA734">
+          <wp:inline distT="0" distB="0" distL="0" distR="0" wp14:anchorId="58DB5AE5" wp14:editId="58E1D773">
             <wp:extent cx="2311200" cy="4795200"/>
             <wp:effectExtent l="0" t="0" r="0" b="5715"/>
             <wp:docPr id="552212732" name="Picture 8"/>
@@ -32704,6 +32544,7 @@
         <w:rPr>
           <w:lang w:val="en-GB"/>
         </w:rPr>
+        <w:lastRenderedPageBreak/>
         <w:t>Giao diện Hồ sơ cá nhân</w:t>
       </w:r>
     </w:p>
@@ -32736,9 +32577,8 @@
         <w:rPr>
           <w:noProof/>
         </w:rPr>
-        <w:lastRenderedPageBreak/>
         <w:drawing>
-          <wp:inline distT="0" distB="0" distL="0" distR="0" wp14:anchorId="68E78FC0" wp14:editId="407A863D">
+          <wp:inline distT="0" distB="0" distL="0" distR="0" wp14:anchorId="68E78FC0" wp14:editId="6F02C8E4">
             <wp:extent cx="2311200" cy="4795200"/>
             <wp:effectExtent l="0" t="0" r="0" b="5715"/>
             <wp:docPr id="1997223553" name="Picture 9"/>
@@ -36992,7 +36832,7 @@
       <w:lvlText w:val="Chương %1."/>
       <w:lvlJc w:val="left"/>
       <w:pPr>
-        <w:ind w:left="710" w:firstLine="0"/>
+        <w:ind w:left="0" w:firstLine="0"/>
       </w:pPr>
       <w:rPr>
         <w:rFonts w:hint="default"/>
@@ -38252,7 +38092,7 @@
         <w:numId w:val="21"/>
       </w:numPr>
       <w:spacing w:after="360"/>
-      <w:ind w:left="0" w:right="567"/>
+      <w:ind w:right="567"/>
       <w:jc w:val="center"/>
       <w:outlineLvl w:val="0"/>
     </w:pPr>

</xml_diff>